<commit_message>
Buyer auctions search/filter/paging, and hide cancelled auctions
- Buyer Auctions page: server-side search (auction, vendor, category),
  status filter, category, starting-price range, sorting and pagination.
  Live vs Upcoming is auctionState=active combined with a start-time
  range, since both are running auctions told apart by whether bidding
  has opened. Placing a bid reloads the page and guards double clicks.

- Cancelled auctions were reaching buyers. The old page filtered them in
  the browser; once listings were paged server-side that filter no longer
  applied, so a withdrawn auction showed in both the marketplace and the
  auctions page. Buyer scope now excludes them in SQL.

Profile Settings routing for buyers was already fixed and deployed in
c84293e; verified live in the deployed bundle.

Co-Authored-By: Claude Opus 5 <noreply@anthropic.com>
</commit_message>
<xml_diff>
--- a/CHANGES.docx
+++ b/CHANGES.docx
@@ -806,6 +806,52 @@
           <w:color w:val="000000"/>
         </w:rPr>
         <w:t xml:space="preserve"> — Fixed. Adding and removing wishlist items call the API and persist per user, and the list is loaded from the backend on login or when the Wishlist page opens. Anything saved in the browser beforehand is merged in once.</w:t>
+      </w:r>
+    </w:p>
+    <w:p>
+      <w:pPr>
+        <w:spacing w:before="0" w:after="120"/>
+        <w:ind w:left="360" w:hanging="220"/>
+      </w:pPr>
+      <w:r>
+        <w:rPr>
+          <w:b/>
+          <w:sz w:val="22"/>
+          <w:szCs w:val="22"/>
+          <w:color w:val="000000"/>
+        </w:rPr>
+        <w:t xml:space="preserve">•  Buyer Auctions page missing pagination, search and filtering</w:t>
+      </w:r>
+      <w:r>
+        <w:rPr>
+          <w:sz w:val="22"/>
+          <w:szCs w:val="22"/>
+          <w:color w:val="000000"/>
+        </w:rPr>
+        <w:t xml:space="preserve"> — Fixed. The auctions page now searches by auction, vendor or category, filters by status (Live now / Upcoming / Ended), category and starting price, sorts by ending time or bid, and pages through results — all server-side. Placing a bid refreshes the list and the button is guarded against double clicks.</w:t>
+      </w:r>
+    </w:p>
+    <w:p>
+      <w:pPr>
+        <w:spacing w:before="0" w:after="120"/>
+        <w:ind w:left="360" w:hanging="220"/>
+      </w:pPr>
+      <w:r>
+        <w:rPr>
+          <w:b/>
+          <w:sz w:val="22"/>
+          <w:szCs w:val="22"/>
+          <w:color w:val="000000"/>
+        </w:rPr>
+        <w:t xml:space="preserve">•  Cancelled auctions were visible to buyers</w:t>
+      </w:r>
+      <w:r>
+        <w:rPr>
+          <w:sz w:val="22"/>
+          <w:szCs w:val="22"/>
+          <w:color w:val="000000"/>
+        </w:rPr>
+        <w:t xml:space="preserve"> — Fixed. Withdrawn auctions were filtered out in the browser, which stopped working once listings were paged server-side; the API now excludes them from every buyer listing.</w:t>
       </w:r>
     </w:p>
     <w:sectPr>

</xml_diff>

<commit_message>
Lazy buyer modules, and verified-only bidding
Buyer portal now loads per module. Cart and wishlist were fetching on
sign-in (introduced with the database migration in 3df28fe); both are now
lazy and cached, loading when their page or the cart drawer opens, with
their own loading states. The header badges would otherwise read zero
until you visited those pages, so a single GET /me/badges returns just
the two counts at sign-in; whichever context asks first triggers it and
the other shares the result.

Bidding now requires a verified account:
- POST /products/:id/bids looks up the bidder and refuses an unverified
  one with a message asking them to verify. Hiding the form is not the
  control; a direct request is refused too.
- The bid is recorded against the authenticated actor rather than a
  body-supplied bidderId, which previously let one buyer place a bid in
  another's name and take the winning position.

Co-Authored-By: Claude Opus 5 <noreply@anthropic.com>
</commit_message>
<xml_diff>
--- a/CHANGES.docx
+++ b/CHANGES.docx
@@ -852,6 +852,52 @@
           <w:color w:val="000000"/>
         </w:rPr>
         <w:t xml:space="preserve"> — Fixed. Withdrawn auctions were filtered out in the browser, which stopped working once listings were paged server-side; the API now excludes them from every buyer listing.</w:t>
+      </w:r>
+    </w:p>
+    <w:p>
+      <w:pPr>
+        <w:spacing w:before="0" w:after="120"/>
+        <w:ind w:left="360" w:hanging="220"/>
+      </w:pPr>
+      <w:r>
+        <w:rPr>
+          <w:b/>
+          <w:sz w:val="22"/>
+          <w:szCs w:val="22"/>
+          <w:color w:val="000000"/>
+        </w:rPr>
+        <w:t xml:space="preserve">•  Buyer portal fetched all module data on login</w:t>
+      </w:r>
+      <w:r>
+        <w:rPr>
+          <w:sz w:val="22"/>
+          <w:szCs w:val="22"/>
+          <w:color w:val="000000"/>
+        </w:rPr>
+        <w:t xml:space="preserve"> — Fixed. Cart, wishlist, orders, marketplace and auctions each load when their page is opened and are cached afterwards, with their own loading state. Only a single small counts request runs at sign-in, to keep the cart and wishlist badges in the header correct.</w:t>
+      </w:r>
+    </w:p>
+    <w:p>
+      <w:pPr>
+        <w:spacing w:before="0" w:after="120"/>
+        <w:ind w:left="360" w:hanging="220"/>
+      </w:pPr>
+      <w:r>
+        <w:rPr>
+          <w:b/>
+          <w:sz w:val="22"/>
+          <w:szCs w:val="22"/>
+          <w:color w:val="000000"/>
+        </w:rPr>
+        <w:t xml:space="preserve">•  Unverified buyers could place bids</w:t>
+      </w:r>
+      <w:r>
+        <w:rPr>
+          <w:sz w:val="22"/>
+          <w:szCs w:val="22"/>
+          <w:color w:val="000000"/>
+        </w:rPr>
+        <w:t xml:space="preserve"> — Fixed. Bidding requires a verified account: the API rejects the bid with a message asking the buyer to verify, and the bid form is replaced by that message. A bid is also now recorded against the signed-in account rather than whatever the request claimed, so one buyer cannot bid in another’s name.</w:t>
       </w:r>
     </w:p>
     <w:sectPr>

</xml_diff>

<commit_message>
Super admin page no longer bounces an existing session to the dashboard
Reported as "Back to sign in triggers login". The button never called
login — it is type="button" and its handler only flipped a flag, and a
session is only ever created by loginWithPassword or completePasswordSetup.

The actual cause was a mount effect that redirected to /admin whenever a
superAdmin session was already in the browser. Landing on /sa with a
session — including after clicking "Back to sign in" — dropped you on the
dashboard with no credentials entered, and left no way to reach sign-in
or password reset short of clearing site data.

An existing session is now offered as a choice: continue to the dashboard,
or sign out and use another account. "Back to sign in" also clears any
half-finished verification attempt (code, password, transaction id)
instead of leaving it in state.

Co-Authored-By: Claude Opus 5 <noreply@anthropic.com>
</commit_message>
<xml_diff>
--- a/CHANGES.docx
+++ b/CHANGES.docx
@@ -470,6 +470,29 @@
           <w:color w:val="1F6F4A"/>
         </w:rPr>
         <w:t xml:space="preserve">Admin</w:t>
+      </w:r>
+    </w:p>
+    <w:p>
+      <w:pPr>
+        <w:spacing w:before="0" w:after="120"/>
+        <w:ind w:left="360" w:hanging="220"/>
+      </w:pPr>
+      <w:r>
+        <w:rPr>
+          <w:b/>
+          <w:sz w:val="22"/>
+          <w:szCs w:val="22"/>
+          <w:color w:val="000000"/>
+        </w:rPr>
+        <w:t xml:space="preserve">•  "Back to sign in" landed on the Dashboard without signing in</w:t>
+      </w:r>
+      <w:r>
+        <w:rPr>
+          <w:sz w:val="22"/>
+          <w:szCs w:val="22"/>
+          <w:color w:val="000000"/>
+        </w:rPr>
+        <w:t xml:space="preserve"> — Fixed. The Super Admin page redirected straight to the dashboard whenever a session already existed in the browser, so returning to the sign-in screen bounced you into the dashboard with no credentials entered — and there was no way to reach sign-in or password reset without clearing site data. An existing session is now shown as a choice (continue, or sign out and use another account), and "Back to sign in" clears any half-finished verification attempt. No login request was ever made by that button.</w:t>
       </w:r>
     </w:p>
     <w:p>

</xml_diff>

<commit_message>
Paginate the super admin dashboard sections
GET /auth/users now supports page, pageSize (or limit as the ticket names
it), search across name/email/phone/city, userType and isActive filters,
and sorting. Callers that send no paging params still get a bare array, so
the users manager and the users context are unaffected.

Recent Users, Recent Orders and Recent Auctions each page independently
with next/previous and a page-size control, fetching only the rows on
screen. The dashboard previously pulled every user, product and order
into the browser and sliced five rows off each.

The stat tiles now come from one-row count queries instead of counting a
downloaded list.

Co-Authored-By: Claude Opus 5 <noreply@anthropic.com>
</commit_message>
<xml_diff>
--- a/CHANGES.docx
+++ b/CHANGES.docx
@@ -470,6 +470,29 @@
           <w:color w:val="1F6F4A"/>
         </w:rPr>
         <w:t xml:space="preserve">Admin</w:t>
+      </w:r>
+    </w:p>
+    <w:p>
+      <w:pPr>
+        <w:spacing w:before="0" w:after="120"/>
+        <w:ind w:left="360" w:hanging="220"/>
+      </w:pPr>
+      <w:r>
+        <w:rPr>
+          <w:b/>
+          <w:sz w:val="22"/>
+          <w:szCs w:val="22"/>
+          <w:color w:val="000000"/>
+        </w:rPr>
+        <w:t xml:space="preserve">•  Dashboard sections had no pagination</w:t>
+      </w:r>
+      <w:r>
+        <w:rPr>
+          <w:sz w:val="22"/>
+          <w:szCs w:val="22"/>
+          <w:color w:val="000000"/>
+        </w:rPr>
+        <w:t xml:space="preserve"> — Fixed. Recent Users, Recent Orders and Recent Auctions each page independently with next/previous and a page-size control, fetching only the rows shown. `GET /auth/users` now supports page, pageSize (or limit), search, userType, isActive and sort; callers that send no paging params still get a plain array. The dashboard totals come from one-row count queries rather than downloading every user, product and order to count them.</w:t>
       </w:r>
     </w:p>
     <w:p>

</xml_diff>

<commit_message>
Keep auctions out of the Products tab, and finish auction tooltips
Auctions were listed in the admin Products tab and in the Products side
of the Approvals queue as well as under Auctions, so the same listing
showed up in two places. Both now exclude them.

That needed a new isAuction filter on the products API: productType names
one type, so it cannot express "anything except auctions".

Auctions table: Close, Cancel and Delete now carry tooltips and
screen-reader labels naming the auction. Delete had none at all.

Server-side paging, search and filtering on the Auctions page were
already delivered earlier and are live; no change needed there.

Co-Authored-By: Claude Opus 5 <noreply@anthropic.com>
</commit_message>
<xml_diff>
--- a/CHANGES.docx
+++ b/CHANGES.docx
@@ -470,6 +470,52 @@
           <w:color w:val="1F6F4A"/>
         </w:rPr>
         <w:t xml:space="preserve">Admin</w:t>
+      </w:r>
+    </w:p>
+    <w:p>
+      <w:pPr>
+        <w:spacing w:before="0" w:after="120"/>
+        <w:ind w:left="360" w:hanging="220"/>
+      </w:pPr>
+      <w:r>
+        <w:rPr>
+          <w:b/>
+          <w:sz w:val="22"/>
+          <w:szCs w:val="22"/>
+          <w:color w:val="000000"/>
+        </w:rPr>
+        <w:t xml:space="preserve">•  Auctions appeared in the Products tab as well as the Auctions tab</w:t>
+      </w:r>
+      <w:r>
+        <w:rPr>
+          <w:sz w:val="22"/>
+          <w:szCs w:val="22"/>
+          <w:color w:val="000000"/>
+        </w:rPr>
+        <w:t xml:space="preserve"> — Fixed. The Products tab and the Products side of the Approvals queue now exclude auctions, so each listing appears under one tab only. Added an `isAuction` filter to the products API: `productType` names a single type and cannot express "anything except auctions".</w:t>
+      </w:r>
+    </w:p>
+    <w:p>
+      <w:pPr>
+        <w:spacing w:before="0" w:after="120"/>
+        <w:ind w:left="360" w:hanging="220"/>
+      </w:pPr>
+      <w:r>
+        <w:rPr>
+          <w:b/>
+          <w:sz w:val="22"/>
+          <w:szCs w:val="22"/>
+          <w:color w:val="000000"/>
+        </w:rPr>
+        <w:t xml:space="preserve">•  Auctions table action icons missing tooltips</w:t>
+      </w:r>
+      <w:r>
+        <w:rPr>
+          <w:sz w:val="22"/>
+          <w:szCs w:val="22"/>
+          <w:color w:val="000000"/>
+        </w:rPr>
+        <w:t xml:space="preserve"> — Fixed. Close, Cancel and Delete all carry a tooltip and a screen-reader label naming the auction; Delete had no tooltip at all.</w:t>
       </w:r>
     </w:p>
     <w:p>

</xml_diff>

<commit_message>
Manage Farmers/Customers: server-side paging, search and filters
Both screens share AdminUsersManager, which loaded every user and
filtered in the browser. They now page from the API with search across
name/email/phone/city, account-type and status filters, sorting and
rows-per-page, all combining server-side.

GET /auth/users now accepts a comma-separated userType list, so "All
Users" can mean farmers and customers without also returning staff
accounts — the browser used to drop admins after fetching them.

Mutations go straight to the users API and reload the current page rather
than refetching the whole list, a row's buttons are disabled while its
action is in flight, and deactivating a farmer still hides their listings.

Action tooltips were already present and live; they now also carry
screen-reader labels naming the user, and the activate/deactivate tooltip
says when listings will be hidden or restored.

Co-Authored-By: Claude Opus 5 <noreply@anthropic.com>
</commit_message>
<xml_diff>
--- a/CHANGES.docx
+++ b/CHANGES.docx
@@ -470,6 +470,29 @@
           <w:color w:val="1F6F4A"/>
         </w:rPr>
         <w:t xml:space="preserve">Admin</w:t>
+      </w:r>
+    </w:p>
+    <w:p>
+      <w:pPr>
+        <w:spacing w:before="0" w:after="120"/>
+        <w:ind w:left="360" w:hanging="220"/>
+      </w:pPr>
+      <w:r>
+        <w:rPr>
+          <w:b/>
+          <w:sz w:val="22"/>
+          <w:szCs w:val="22"/>
+          <w:color w:val="000000"/>
+        </w:rPr>
+        <w:t xml:space="preserve">•  Manage Farmers / Customers had no server-side pagination, search or filtering</w:t>
+      </w:r>
+      <w:r>
+        <w:rPr>
+          <w:sz w:val="22"/>
+          <w:szCs w:val="22"/>
+          <w:color w:val="000000"/>
+        </w:rPr>
+        <w:t xml:space="preserve"> — Fixed. Both pages page from the API with search (name, email, phone, city), account type and status filters, sorting and rows-per-page, all applied server-side. The users API accepts a comma-separated type list so "All Users" means farmers and customers without pulling staff accounts. Deactivating a farmer still hides their listings, and a row’s buttons are disabled while its action is in flight.</w:t>
       </w:r>
     </w:p>
     <w:p>

</xml_diff>

<commit_message>
Stop polling close-expired-auctions, and stop it re-rendering the app
Two separate problems behind the same symptom.

The polling: the Auctions page ran settlement every 30s. It now runs once
when the page opens, plus an explicit Refresh button. Nothing fires while
the admin is idle.

The re-renders: closeExpiredAuctions wrote setProducts(mergeProducts(...))
on every call, and mergeProducts always returns a new array — so each poll
changed the ProductContext value and re-rendered every consumer in the
app, even though the usual result is "nothing closed". It now returns
early without touching state unless an auction actually closed, and
settleAuctions reports how many it settled so the table reloads only then.

Long-term this job belongs in a server-side cron rather than depending on
an admin having the page open.

Co-Authored-By: Claude Opus 5 <noreply@anthropic.com>
</commit_message>
<xml_diff>
--- a/CHANGES.docx
+++ b/CHANGES.docx
@@ -470,6 +470,29 @@
           <w:color w:val="1F6F4A"/>
         </w:rPr>
         <w:t xml:space="preserve">Admin</w:t>
+      </w:r>
+    </w:p>
+    <w:p>
+      <w:pPr>
+        <w:spacing w:before="0" w:after="120"/>
+        <w:ind w:left="360" w:hanging="220"/>
+      </w:pPr>
+      <w:r>
+        <w:rPr>
+          <w:b/>
+          <w:sz w:val="22"/>
+          <w:szCs w:val="22"/>
+          <w:color w:val="000000"/>
+        </w:rPr>
+        <w:t xml:space="preserve">•  Close/expired-auctions API polled on a timer and re-rendered the app</w:t>
+      </w:r>
+      <w:r>
+        <w:rPr>
+          <w:sz w:val="22"/>
+          <w:szCs w:val="22"/>
+          <w:color w:val="000000"/>
+        </w:rPr>
+        <w:t xml:space="preserve"> — Fixed. It no longer polls: it runs once when the Auctions page opens and otherwise only when the admin presses Refresh. The bigger cost was that each call wrote a freshly built product array into the shared context even when nothing had closed, re-rendering every screen using it — the state is now left untouched unless an auction actually closed, and the table reloads only then.</w:t>
       </w:r>
     </w:p>
     <w:p>

</xml_diff>

<commit_message>
Delete a user's data with the user
No user_id column carries a foreign key, so DELETE FROM users removed the
account row and nothing else — listings, basket, wishlist, notifications,
bids, read markers and uploaded files all stayed behind.

Deletion is now one transaction: their listings go (bids/cart/wishlist
rows attached to those listings cascade through the product foreign key),
along with their own cart, wishlist, notifications, notification_reads and
bids; any auction they were winning is cleared of them; and their product
images and CNIC documents are removed from disk once the transaction
commits.

Orders are deliberately kept and anonymised rather than deleted. An order
is also the seller's sales record, so removing it would rewrite their
earnings history. Personal fields are replaced with "Deleted account".

deleteStoredFile refuses any path that resolves outside the upload root.

Co-Authored-By: Claude Opus 5 <noreply@anthropic.com>
</commit_message>
<xml_diff>
--- a/CHANGES.docx
+++ b/CHANGES.docx
@@ -470,6 +470,29 @@
           <w:color w:val="1F6F4A"/>
         </w:rPr>
         <w:t xml:space="preserve">Admin</w:t>
+      </w:r>
+    </w:p>
+    <w:p>
+      <w:pPr>
+        <w:spacing w:before="0" w:after="120"/>
+        <w:ind w:left="360" w:hanging="220"/>
+      </w:pPr>
+      <w:r>
+        <w:rPr>
+          <w:b/>
+          <w:sz w:val="22"/>
+          <w:szCs w:val="22"/>
+          <w:color w:val="000000"/>
+        </w:rPr>
+        <w:t xml:space="preserve">•  Deleting a farmer or customer left their data behind</w:t>
+      </w:r>
+      <w:r>
+        <w:rPr>
+          <w:sz w:val="22"/>
+          <w:szCs w:val="22"/>
+          <w:color w:val="000000"/>
+        </w:rPr>
+        <w:t xml:space="preserve"> — Fixed. None of the user_id columns carried a foreign key, so deleting an account removed only the account row. Deletion now runs as one transaction that also removes their listings (and the bids, cart and wishlist rows attached to those listings), their own basket, wishlist, notifications, read markers and bids, clears them from any auction they were winning, and deletes their uploaded product images and CNIC documents from disk. Orders are kept but stripped of personal details, because an order is also the seller’s sales record and deleting it would rewrite their earnings.</w:t>
       </w:r>
     </w:p>
     <w:p>

</xml_diff>